<commit_message>
docs: remplacement du rapport par la version avec dictionnaire de donnees
</commit_message>
<xml_diff>
--- a/docs/Rapport_CabinetMedical.docx
+++ b/docs/Rapport_CabinetMedical.docx
@@ -454,7 +454,3158 @@
         <w:spacing w:after="150" w:before="300"/>
       </w:pPr>
       <w:r>
-        <w:t xml:space="preserve">3.1 Tables, cles primaires et cles etrangeres</w:t>
+        <w:t xml:space="preserve">3.1 Dictionnaire de donnees (associe au MCD)</w:t>
+      </w:r>
+    </w:p>
+    <w:p>
+      <w:pPr>
+        <w:spacing w:after="150"/>
+      </w:pPr>
+      <w:r>
+        <w:t xml:space="preserve">Ce dictionnaire liste, pour chaque entite du modele conceptuel, ses attributs, leur type et leur role.</w:t>
+      </w:r>
+    </w:p>
+    <w:tbl>
+      <w:tblPr>
+        <w:tblW w:type="dxa" w:w="10000"/>
+        <w:tblBorders>
+          <w:top w:val="single" w:color="auto" w:sz="4"/>
+          <w:left w:val="single" w:color="auto" w:sz="4"/>
+          <w:bottom w:val="single" w:color="auto" w:sz="4"/>
+          <w:right w:val="single" w:color="auto" w:sz="4"/>
+          <w:insideH w:val="single" w:color="auto" w:sz="4"/>
+          <w:insideV w:val="single" w:color="auto" w:sz="4"/>
+        </w:tblBorders>
+      </w:tblPr>
+      <w:tblGrid>
+        <w:gridCol w:w="100"/>
+        <w:gridCol w:w="100"/>
+        <w:gridCol w:w="100"/>
+        <w:gridCol w:w="100"/>
+      </w:tblGrid>
+      <w:tr>
+        <w:tc>
+          <w:tcPr>
+            <w:tcW w:type="dxa" w:w="2500"/>
+            <w:shd w:fill="185FA5" w:val="clear"/>
+          </w:tcPr>
+          <w:p>
+            <w:r>
+              <w:rPr>
+                <w:b/>
+                <w:bCs/>
+                <w:color w:val="FFFFFF"/>
+                <w:sz w:val="18"/>
+                <w:szCs w:val="18"/>
+              </w:rPr>
+              <w:t xml:space="preserve">Entite</w:t>
+            </w:r>
+          </w:p>
+        </w:tc>
+        <w:tc>
+          <w:tcPr>
+            <w:tcW w:type="dxa" w:w="2500"/>
+            <w:shd w:fill="185FA5" w:val="clear"/>
+          </w:tcPr>
+          <w:p>
+            <w:r>
+              <w:rPr>
+                <w:b/>
+                <w:bCs/>
+                <w:color w:val="FFFFFF"/>
+                <w:sz w:val="18"/>
+                <w:szCs w:val="18"/>
+              </w:rPr>
+              <w:t xml:space="preserve">Attribut</w:t>
+            </w:r>
+          </w:p>
+        </w:tc>
+        <w:tc>
+          <w:tcPr>
+            <w:tcW w:type="dxa" w:w="2500"/>
+            <w:shd w:fill="185FA5" w:val="clear"/>
+          </w:tcPr>
+          <w:p>
+            <w:r>
+              <w:rPr>
+                <w:b/>
+                <w:bCs/>
+                <w:color w:val="FFFFFF"/>
+                <w:sz w:val="18"/>
+                <w:szCs w:val="18"/>
+              </w:rPr>
+              <w:t xml:space="preserve">Type</w:t>
+            </w:r>
+          </w:p>
+        </w:tc>
+        <w:tc>
+          <w:tcPr>
+            <w:tcW w:type="dxa" w:w="2500"/>
+            <w:shd w:fill="185FA5" w:val="clear"/>
+          </w:tcPr>
+          <w:p>
+            <w:r>
+              <w:rPr>
+                <w:b/>
+                <w:bCs/>
+                <w:color w:val="FFFFFF"/>
+                <w:sz w:val="18"/>
+                <w:szCs w:val="18"/>
+              </w:rPr>
+              <w:t xml:space="preserve">Description</w:t>
+            </w:r>
+          </w:p>
+        </w:tc>
+      </w:tr>
+      <w:tr>
+        <w:tc>
+          <w:tcPr>
+            <w:tcW w:type="dxa" w:w="2500"/>
+          </w:tcPr>
+          <w:p>
+            <w:r>
+              <w:rPr>
+                <w:b w:val="false"/>
+                <w:bCs w:val="false"/>
+                <w:sz w:val="18"/>
+                <w:szCs w:val="18"/>
+              </w:rPr>
+              <w:t xml:space="preserve">MEDECIN</w:t>
+            </w:r>
+          </w:p>
+        </w:tc>
+        <w:tc>
+          <w:tcPr>
+            <w:tcW w:type="dxa" w:w="2500"/>
+          </w:tcPr>
+          <w:p>
+            <w:r>
+              <w:rPr>
+                <w:b w:val="false"/>
+                <w:bCs w:val="false"/>
+                <w:sz w:val="18"/>
+                <w:szCs w:val="18"/>
+              </w:rPr>
+              <w:t xml:space="preserve">NumMedecin</w:t>
+            </w:r>
+          </w:p>
+        </w:tc>
+        <w:tc>
+          <w:tcPr>
+            <w:tcW w:type="dxa" w:w="2500"/>
+          </w:tcPr>
+          <w:p>
+            <w:r>
+              <w:rPr>
+                <w:b w:val="false"/>
+                <w:bCs w:val="false"/>
+                <w:sz w:val="18"/>
+                <w:szCs w:val="18"/>
+              </w:rPr>
+              <w:t xml:space="preserve">int</w:t>
+            </w:r>
+          </w:p>
+        </w:tc>
+        <w:tc>
+          <w:tcPr>
+            <w:tcW w:type="dxa" w:w="2500"/>
+          </w:tcPr>
+          <w:p>
+            <w:r>
+              <w:rPr>
+                <w:b w:val="false"/>
+                <w:bCs w:val="false"/>
+                <w:sz w:val="18"/>
+                <w:szCs w:val="18"/>
+              </w:rPr>
+              <w:t xml:space="preserve">Identifiant du medecin (PK)</w:t>
+            </w:r>
+          </w:p>
+        </w:tc>
+      </w:tr>
+      <w:tr>
+        <w:tc>
+          <w:tcPr>
+            <w:tcW w:type="dxa" w:w="2500"/>
+          </w:tcPr>
+          <w:p>
+            <w:r>
+              <w:rPr>
+                <w:b w:val="false"/>
+                <w:bCs w:val="false"/>
+                <w:sz w:val="18"/>
+                <w:szCs w:val="18"/>
+              </w:rPr>
+              <w:t xml:space="preserve">MEDECIN</w:t>
+            </w:r>
+          </w:p>
+        </w:tc>
+        <w:tc>
+          <w:tcPr>
+            <w:tcW w:type="dxa" w:w="2500"/>
+          </w:tcPr>
+          <w:p>
+            <w:r>
+              <w:rPr>
+                <w:b w:val="false"/>
+                <w:bCs w:val="false"/>
+                <w:sz w:val="18"/>
+                <w:szCs w:val="18"/>
+              </w:rPr>
+              <w:t xml:space="preserve">NomMedecin</w:t>
+            </w:r>
+          </w:p>
+        </w:tc>
+        <w:tc>
+          <w:tcPr>
+            <w:tcW w:type="dxa" w:w="2500"/>
+          </w:tcPr>
+          <w:p>
+            <w:r>
+              <w:rPr>
+                <w:b w:val="false"/>
+                <w:bCs w:val="false"/>
+                <w:sz w:val="18"/>
+                <w:szCs w:val="18"/>
+              </w:rPr>
+              <w:t xml:space="preserve">varchar(50)</w:t>
+            </w:r>
+          </w:p>
+        </w:tc>
+        <w:tc>
+          <w:tcPr>
+            <w:tcW w:type="dxa" w:w="2500"/>
+          </w:tcPr>
+          <w:p>
+            <w:r>
+              <w:rPr>
+                <w:b w:val="false"/>
+                <w:bCs w:val="false"/>
+                <w:sz w:val="18"/>
+                <w:szCs w:val="18"/>
+              </w:rPr>
+              <w:t xml:space="preserve">Nom du medecin</w:t>
+            </w:r>
+          </w:p>
+        </w:tc>
+      </w:tr>
+      <w:tr>
+        <w:tc>
+          <w:tcPr>
+            <w:tcW w:type="dxa" w:w="2500"/>
+          </w:tcPr>
+          <w:p>
+            <w:r>
+              <w:rPr>
+                <w:b w:val="false"/>
+                <w:bCs w:val="false"/>
+                <w:sz w:val="18"/>
+                <w:szCs w:val="18"/>
+              </w:rPr>
+              <w:t xml:space="preserve">MEDECIN</w:t>
+            </w:r>
+          </w:p>
+        </w:tc>
+        <w:tc>
+          <w:tcPr>
+            <w:tcW w:type="dxa" w:w="2500"/>
+          </w:tcPr>
+          <w:p>
+            <w:r>
+              <w:rPr>
+                <w:b w:val="false"/>
+                <w:bCs w:val="false"/>
+                <w:sz w:val="18"/>
+                <w:szCs w:val="18"/>
+              </w:rPr>
+              <w:t xml:space="preserve">PrenomMedecin</w:t>
+            </w:r>
+          </w:p>
+        </w:tc>
+        <w:tc>
+          <w:tcPr>
+            <w:tcW w:type="dxa" w:w="2500"/>
+          </w:tcPr>
+          <w:p>
+            <w:r>
+              <w:rPr>
+                <w:b w:val="false"/>
+                <w:bCs w:val="false"/>
+                <w:sz w:val="18"/>
+                <w:szCs w:val="18"/>
+              </w:rPr>
+              <w:t xml:space="preserve">varchar(50)</w:t>
+            </w:r>
+          </w:p>
+        </w:tc>
+        <w:tc>
+          <w:tcPr>
+            <w:tcW w:type="dxa" w:w="2500"/>
+          </w:tcPr>
+          <w:p>
+            <w:r>
+              <w:rPr>
+                <w:b w:val="false"/>
+                <w:bCs w:val="false"/>
+                <w:sz w:val="18"/>
+                <w:szCs w:val="18"/>
+              </w:rPr>
+              <w:t xml:space="preserve">Prenom du medecin</w:t>
+            </w:r>
+          </w:p>
+        </w:tc>
+      </w:tr>
+      <w:tr>
+        <w:tc>
+          <w:tcPr>
+            <w:tcW w:type="dxa" w:w="2500"/>
+          </w:tcPr>
+          <w:p>
+            <w:r>
+              <w:rPr>
+                <w:b w:val="false"/>
+                <w:bCs w:val="false"/>
+                <w:sz w:val="18"/>
+                <w:szCs w:val="18"/>
+              </w:rPr>
+              <w:t xml:space="preserve">MEDECIN</w:t>
+            </w:r>
+          </w:p>
+        </w:tc>
+        <w:tc>
+          <w:tcPr>
+            <w:tcW w:type="dxa" w:w="2500"/>
+          </w:tcPr>
+          <w:p>
+            <w:r>
+              <w:rPr>
+                <w:b w:val="false"/>
+                <w:bCs w:val="false"/>
+                <w:sz w:val="18"/>
+                <w:szCs w:val="18"/>
+              </w:rPr>
+              <w:t xml:space="preserve">Specialite</w:t>
+            </w:r>
+          </w:p>
+        </w:tc>
+        <w:tc>
+          <w:tcPr>
+            <w:tcW w:type="dxa" w:w="2500"/>
+          </w:tcPr>
+          <w:p>
+            <w:r>
+              <w:rPr>
+                <w:b w:val="false"/>
+                <w:bCs w:val="false"/>
+                <w:sz w:val="18"/>
+                <w:szCs w:val="18"/>
+              </w:rPr>
+              <w:t xml:space="preserve">varchar(100)</w:t>
+            </w:r>
+          </w:p>
+        </w:tc>
+        <w:tc>
+          <w:tcPr>
+            <w:tcW w:type="dxa" w:w="2500"/>
+          </w:tcPr>
+          <w:p>
+            <w:r>
+              <w:rPr>
+                <w:b w:val="false"/>
+                <w:bCs w:val="false"/>
+                <w:sz w:val="18"/>
+                <w:szCs w:val="18"/>
+              </w:rPr>
+              <w:t xml:space="preserve">Specialite medicale</w:t>
+            </w:r>
+          </w:p>
+        </w:tc>
+      </w:tr>
+      <w:tr>
+        <w:tc>
+          <w:tcPr>
+            <w:tcW w:type="dxa" w:w="2500"/>
+          </w:tcPr>
+          <w:p>
+            <w:r>
+              <w:rPr>
+                <w:b w:val="false"/>
+                <w:bCs w:val="false"/>
+                <w:sz w:val="18"/>
+                <w:szCs w:val="18"/>
+              </w:rPr>
+              <w:t xml:space="preserve">PATIENT</w:t>
+            </w:r>
+          </w:p>
+        </w:tc>
+        <w:tc>
+          <w:tcPr>
+            <w:tcW w:type="dxa" w:w="2500"/>
+          </w:tcPr>
+          <w:p>
+            <w:r>
+              <w:rPr>
+                <w:b w:val="false"/>
+                <w:bCs w:val="false"/>
+                <w:sz w:val="18"/>
+                <w:szCs w:val="18"/>
+              </w:rPr>
+              <w:t xml:space="preserve">NumPatient</w:t>
+            </w:r>
+          </w:p>
+        </w:tc>
+        <w:tc>
+          <w:tcPr>
+            <w:tcW w:type="dxa" w:w="2500"/>
+          </w:tcPr>
+          <w:p>
+            <w:r>
+              <w:rPr>
+                <w:b w:val="false"/>
+                <w:bCs w:val="false"/>
+                <w:sz w:val="18"/>
+                <w:szCs w:val="18"/>
+              </w:rPr>
+              <w:t xml:space="preserve">int</w:t>
+            </w:r>
+          </w:p>
+        </w:tc>
+        <w:tc>
+          <w:tcPr>
+            <w:tcW w:type="dxa" w:w="2500"/>
+          </w:tcPr>
+          <w:p>
+            <w:r>
+              <w:rPr>
+                <w:b w:val="false"/>
+                <w:bCs w:val="false"/>
+                <w:sz w:val="18"/>
+                <w:szCs w:val="18"/>
+              </w:rPr>
+              <w:t xml:space="preserve">Identifiant du patient (PK)</w:t>
+            </w:r>
+          </w:p>
+        </w:tc>
+      </w:tr>
+      <w:tr>
+        <w:tc>
+          <w:tcPr>
+            <w:tcW w:type="dxa" w:w="2500"/>
+          </w:tcPr>
+          <w:p>
+            <w:r>
+              <w:rPr>
+                <w:b w:val="false"/>
+                <w:bCs w:val="false"/>
+                <w:sz w:val="18"/>
+                <w:szCs w:val="18"/>
+              </w:rPr>
+              <w:t xml:space="preserve">PATIENT</w:t>
+            </w:r>
+          </w:p>
+        </w:tc>
+        <w:tc>
+          <w:tcPr>
+            <w:tcW w:type="dxa" w:w="2500"/>
+          </w:tcPr>
+          <w:p>
+            <w:r>
+              <w:rPr>
+                <w:b w:val="false"/>
+                <w:bCs w:val="false"/>
+                <w:sz w:val="18"/>
+                <w:szCs w:val="18"/>
+              </w:rPr>
+              <w:t xml:space="preserve">NomPatient</w:t>
+            </w:r>
+          </w:p>
+        </w:tc>
+        <w:tc>
+          <w:tcPr>
+            <w:tcW w:type="dxa" w:w="2500"/>
+          </w:tcPr>
+          <w:p>
+            <w:r>
+              <w:rPr>
+                <w:b w:val="false"/>
+                <w:bCs w:val="false"/>
+                <w:sz w:val="18"/>
+                <w:szCs w:val="18"/>
+              </w:rPr>
+              <w:t xml:space="preserve">varchar(50)</w:t>
+            </w:r>
+          </w:p>
+        </w:tc>
+        <w:tc>
+          <w:tcPr>
+            <w:tcW w:type="dxa" w:w="2500"/>
+          </w:tcPr>
+          <w:p>
+            <w:r>
+              <w:rPr>
+                <w:b w:val="false"/>
+                <w:bCs w:val="false"/>
+                <w:sz w:val="18"/>
+                <w:szCs w:val="18"/>
+              </w:rPr>
+              <w:t xml:space="preserve">Nom du patient</w:t>
+            </w:r>
+          </w:p>
+        </w:tc>
+      </w:tr>
+      <w:tr>
+        <w:tc>
+          <w:tcPr>
+            <w:tcW w:type="dxa" w:w="2500"/>
+          </w:tcPr>
+          <w:p>
+            <w:r>
+              <w:rPr>
+                <w:b w:val="false"/>
+                <w:bCs w:val="false"/>
+                <w:sz w:val="18"/>
+                <w:szCs w:val="18"/>
+              </w:rPr>
+              <w:t xml:space="preserve">PATIENT</w:t>
+            </w:r>
+          </w:p>
+        </w:tc>
+        <w:tc>
+          <w:tcPr>
+            <w:tcW w:type="dxa" w:w="2500"/>
+          </w:tcPr>
+          <w:p>
+            <w:r>
+              <w:rPr>
+                <w:b w:val="false"/>
+                <w:bCs w:val="false"/>
+                <w:sz w:val="18"/>
+                <w:szCs w:val="18"/>
+              </w:rPr>
+              <w:t xml:space="preserve">PrenomPatient</w:t>
+            </w:r>
+          </w:p>
+        </w:tc>
+        <w:tc>
+          <w:tcPr>
+            <w:tcW w:type="dxa" w:w="2500"/>
+          </w:tcPr>
+          <w:p>
+            <w:r>
+              <w:rPr>
+                <w:b w:val="false"/>
+                <w:bCs w:val="false"/>
+                <w:sz w:val="18"/>
+                <w:szCs w:val="18"/>
+              </w:rPr>
+              <w:t xml:space="preserve">varchar(50)</w:t>
+            </w:r>
+          </w:p>
+        </w:tc>
+        <w:tc>
+          <w:tcPr>
+            <w:tcW w:type="dxa" w:w="2500"/>
+          </w:tcPr>
+          <w:p>
+            <w:r>
+              <w:rPr>
+                <w:b w:val="false"/>
+                <w:bCs w:val="false"/>
+                <w:sz w:val="18"/>
+                <w:szCs w:val="18"/>
+              </w:rPr>
+              <w:t xml:space="preserve">Prenom du patient</w:t>
+            </w:r>
+          </w:p>
+        </w:tc>
+      </w:tr>
+      <w:tr>
+        <w:tc>
+          <w:tcPr>
+            <w:tcW w:type="dxa" w:w="2500"/>
+          </w:tcPr>
+          <w:p>
+            <w:r>
+              <w:rPr>
+                <w:b w:val="false"/>
+                <w:bCs w:val="false"/>
+                <w:sz w:val="18"/>
+                <w:szCs w:val="18"/>
+              </w:rPr>
+              <w:t xml:space="preserve">PATIENT</w:t>
+            </w:r>
+          </w:p>
+        </w:tc>
+        <w:tc>
+          <w:tcPr>
+            <w:tcW w:type="dxa" w:w="2500"/>
+          </w:tcPr>
+          <w:p>
+            <w:r>
+              <w:rPr>
+                <w:b w:val="false"/>
+                <w:bCs w:val="false"/>
+                <w:sz w:val="18"/>
+                <w:szCs w:val="18"/>
+              </w:rPr>
+              <w:t xml:space="preserve">DateNaissance</w:t>
+            </w:r>
+          </w:p>
+        </w:tc>
+        <w:tc>
+          <w:tcPr>
+            <w:tcW w:type="dxa" w:w="2500"/>
+          </w:tcPr>
+          <w:p>
+            <w:r>
+              <w:rPr>
+                <w:b w:val="false"/>
+                <w:bCs w:val="false"/>
+                <w:sz w:val="18"/>
+                <w:szCs w:val="18"/>
+              </w:rPr>
+              <w:t xml:space="preserve">date</w:t>
+            </w:r>
+          </w:p>
+        </w:tc>
+        <w:tc>
+          <w:tcPr>
+            <w:tcW w:type="dxa" w:w="2500"/>
+          </w:tcPr>
+          <w:p>
+            <w:r>
+              <w:rPr>
+                <w:b w:val="false"/>
+                <w:bCs w:val="false"/>
+                <w:sz w:val="18"/>
+                <w:szCs w:val="18"/>
+              </w:rPr>
+              <w:t xml:space="preserve">Date de naissance</w:t>
+            </w:r>
+          </w:p>
+        </w:tc>
+      </w:tr>
+      <w:tr>
+        <w:tc>
+          <w:tcPr>
+            <w:tcW w:type="dxa" w:w="2500"/>
+          </w:tcPr>
+          <w:p>
+            <w:r>
+              <w:rPr>
+                <w:b w:val="false"/>
+                <w:bCs w:val="false"/>
+                <w:sz w:val="18"/>
+                <w:szCs w:val="18"/>
+              </w:rPr>
+              <w:t xml:space="preserve">PATIENT</w:t>
+            </w:r>
+          </w:p>
+        </w:tc>
+        <w:tc>
+          <w:tcPr>
+            <w:tcW w:type="dxa" w:w="2500"/>
+          </w:tcPr>
+          <w:p>
+            <w:r>
+              <w:rPr>
+                <w:b w:val="false"/>
+                <w:bCs w:val="false"/>
+                <w:sz w:val="18"/>
+                <w:szCs w:val="18"/>
+              </w:rPr>
+              <w:t xml:space="preserve">Poids</w:t>
+            </w:r>
+          </w:p>
+        </w:tc>
+        <w:tc>
+          <w:tcPr>
+            <w:tcW w:type="dxa" w:w="2500"/>
+          </w:tcPr>
+          <w:p>
+            <w:r>
+              <w:rPr>
+                <w:b w:val="false"/>
+                <w:bCs w:val="false"/>
+                <w:sz w:val="18"/>
+                <w:szCs w:val="18"/>
+              </w:rPr>
+              <w:t xml:space="preserve">decimal(5,2)</w:t>
+            </w:r>
+          </w:p>
+        </w:tc>
+        <w:tc>
+          <w:tcPr>
+            <w:tcW w:type="dxa" w:w="2500"/>
+          </w:tcPr>
+          <w:p>
+            <w:r>
+              <w:rPr>
+                <w:b w:val="false"/>
+                <w:bCs w:val="false"/>
+                <w:sz w:val="18"/>
+                <w:szCs w:val="18"/>
+              </w:rPr>
+              <w:t xml:space="preserve">Poids en kg</w:t>
+            </w:r>
+          </w:p>
+        </w:tc>
+      </w:tr>
+      <w:tr>
+        <w:tc>
+          <w:tcPr>
+            <w:tcW w:type="dxa" w:w="2500"/>
+          </w:tcPr>
+          <w:p>
+            <w:r>
+              <w:rPr>
+                <w:b w:val="false"/>
+                <w:bCs w:val="false"/>
+                <w:sz w:val="18"/>
+                <w:szCs w:val="18"/>
+              </w:rPr>
+              <w:t xml:space="preserve">PATIENT</w:t>
+            </w:r>
+          </w:p>
+        </w:tc>
+        <w:tc>
+          <w:tcPr>
+            <w:tcW w:type="dxa" w:w="2500"/>
+          </w:tcPr>
+          <w:p>
+            <w:r>
+              <w:rPr>
+                <w:b w:val="false"/>
+                <w:bCs w:val="false"/>
+                <w:sz w:val="18"/>
+                <w:szCs w:val="18"/>
+              </w:rPr>
+              <w:t xml:space="preserve">Taille</w:t>
+            </w:r>
+          </w:p>
+        </w:tc>
+        <w:tc>
+          <w:tcPr>
+            <w:tcW w:type="dxa" w:w="2500"/>
+          </w:tcPr>
+          <w:p>
+            <w:r>
+              <w:rPr>
+                <w:b w:val="false"/>
+                <w:bCs w:val="false"/>
+                <w:sz w:val="18"/>
+                <w:szCs w:val="18"/>
+              </w:rPr>
+              <w:t xml:space="preserve">decimal(5,2)</w:t>
+            </w:r>
+          </w:p>
+        </w:tc>
+        <w:tc>
+          <w:tcPr>
+            <w:tcW w:type="dxa" w:w="2500"/>
+          </w:tcPr>
+          <w:p>
+            <w:r>
+              <w:rPr>
+                <w:b w:val="false"/>
+                <w:bCs w:val="false"/>
+                <w:sz w:val="18"/>
+                <w:szCs w:val="18"/>
+              </w:rPr>
+              <w:t xml:space="preserve">Taille en metres</w:t>
+            </w:r>
+          </w:p>
+        </w:tc>
+      </w:tr>
+      <w:tr>
+        <w:tc>
+          <w:tcPr>
+            <w:tcW w:type="dxa" w:w="2500"/>
+          </w:tcPr>
+          <w:p>
+            <w:r>
+              <w:rPr>
+                <w:b w:val="false"/>
+                <w:bCs w:val="false"/>
+                <w:sz w:val="18"/>
+                <w:szCs w:val="18"/>
+              </w:rPr>
+              <w:t xml:space="preserve">PATIENT</w:t>
+            </w:r>
+          </w:p>
+        </w:tc>
+        <w:tc>
+          <w:tcPr>
+            <w:tcW w:type="dxa" w:w="2500"/>
+          </w:tcPr>
+          <w:p>
+            <w:r>
+              <w:rPr>
+                <w:b w:val="false"/>
+                <w:bCs w:val="false"/>
+                <w:sz w:val="18"/>
+                <w:szCs w:val="18"/>
+              </w:rPr>
+              <w:t xml:space="preserve">Telephone</w:t>
+            </w:r>
+          </w:p>
+        </w:tc>
+        <w:tc>
+          <w:tcPr>
+            <w:tcW w:type="dxa" w:w="2500"/>
+          </w:tcPr>
+          <w:p>
+            <w:r>
+              <w:rPr>
+                <w:b w:val="false"/>
+                <w:bCs w:val="false"/>
+                <w:sz w:val="18"/>
+                <w:szCs w:val="18"/>
+              </w:rPr>
+              <w:t xml:space="preserve">varchar(50)</w:t>
+            </w:r>
+          </w:p>
+        </w:tc>
+        <w:tc>
+          <w:tcPr>
+            <w:tcW w:type="dxa" w:w="2500"/>
+          </w:tcPr>
+          <w:p>
+            <w:r>
+              <w:rPr>
+                <w:b w:val="false"/>
+                <w:bCs w:val="false"/>
+                <w:sz w:val="18"/>
+                <w:szCs w:val="18"/>
+              </w:rPr>
+              <w:t xml:space="preserve">Numero de telephone</w:t>
+            </w:r>
+          </w:p>
+        </w:tc>
+      </w:tr>
+      <w:tr>
+        <w:tc>
+          <w:tcPr>
+            <w:tcW w:type="dxa" w:w="2500"/>
+          </w:tcPr>
+          <w:p>
+            <w:r>
+              <w:rPr>
+                <w:b w:val="false"/>
+                <w:bCs w:val="false"/>
+                <w:sz w:val="18"/>
+                <w:szCs w:val="18"/>
+              </w:rPr>
+              <w:t xml:space="preserve">PATIENT</w:t>
+            </w:r>
+          </w:p>
+        </w:tc>
+        <w:tc>
+          <w:tcPr>
+            <w:tcW w:type="dxa" w:w="2500"/>
+          </w:tcPr>
+          <w:p>
+            <w:r>
+              <w:rPr>
+                <w:b w:val="false"/>
+                <w:bCs w:val="false"/>
+                <w:sz w:val="18"/>
+                <w:szCs w:val="18"/>
+              </w:rPr>
+              <w:t xml:space="preserve">Adresse</w:t>
+            </w:r>
+          </w:p>
+        </w:tc>
+        <w:tc>
+          <w:tcPr>
+            <w:tcW w:type="dxa" w:w="2500"/>
+          </w:tcPr>
+          <w:p>
+            <w:r>
+              <w:rPr>
+                <w:b w:val="false"/>
+                <w:bCs w:val="false"/>
+                <w:sz w:val="18"/>
+                <w:szCs w:val="18"/>
+              </w:rPr>
+              <w:t xml:space="preserve">varchar(100)</w:t>
+            </w:r>
+          </w:p>
+        </w:tc>
+        <w:tc>
+          <w:tcPr>
+            <w:tcW w:type="dxa" w:w="2500"/>
+          </w:tcPr>
+          <w:p>
+            <w:r>
+              <w:rPr>
+                <w:b w:val="false"/>
+                <w:bCs w:val="false"/>
+                <w:sz w:val="18"/>
+                <w:szCs w:val="18"/>
+              </w:rPr>
+              <w:t xml:space="preserve">Adresse postale</w:t>
+            </w:r>
+          </w:p>
+        </w:tc>
+      </w:tr>
+      <w:tr>
+        <w:tc>
+          <w:tcPr>
+            <w:tcW w:type="dxa" w:w="2500"/>
+          </w:tcPr>
+          <w:p>
+            <w:r>
+              <w:rPr>
+                <w:b w:val="false"/>
+                <w:bCs w:val="false"/>
+                <w:sz w:val="18"/>
+                <w:szCs w:val="18"/>
+              </w:rPr>
+              <w:t xml:space="preserve">VISITE</w:t>
+            </w:r>
+          </w:p>
+        </w:tc>
+        <w:tc>
+          <w:tcPr>
+            <w:tcW w:type="dxa" w:w="2500"/>
+          </w:tcPr>
+          <w:p>
+            <w:r>
+              <w:rPr>
+                <w:b w:val="false"/>
+                <w:bCs w:val="false"/>
+                <w:sz w:val="18"/>
+                <w:szCs w:val="18"/>
+              </w:rPr>
+              <w:t xml:space="preserve">NumVisite</w:t>
+            </w:r>
+          </w:p>
+        </w:tc>
+        <w:tc>
+          <w:tcPr>
+            <w:tcW w:type="dxa" w:w="2500"/>
+          </w:tcPr>
+          <w:p>
+            <w:r>
+              <w:rPr>
+                <w:b w:val="false"/>
+                <w:bCs w:val="false"/>
+                <w:sz w:val="18"/>
+                <w:szCs w:val="18"/>
+              </w:rPr>
+              <w:t xml:space="preserve">int</w:t>
+            </w:r>
+          </w:p>
+        </w:tc>
+        <w:tc>
+          <w:tcPr>
+            <w:tcW w:type="dxa" w:w="2500"/>
+          </w:tcPr>
+          <w:p>
+            <w:r>
+              <w:rPr>
+                <w:b w:val="false"/>
+                <w:bCs w:val="false"/>
+                <w:sz w:val="18"/>
+                <w:szCs w:val="18"/>
+              </w:rPr>
+              <w:t xml:space="preserve">Identifiant de la visite (PK)</w:t>
+            </w:r>
+          </w:p>
+        </w:tc>
+      </w:tr>
+      <w:tr>
+        <w:tc>
+          <w:tcPr>
+            <w:tcW w:type="dxa" w:w="2500"/>
+          </w:tcPr>
+          <w:p>
+            <w:r>
+              <w:rPr>
+                <w:b w:val="false"/>
+                <w:bCs w:val="false"/>
+                <w:sz w:val="18"/>
+                <w:szCs w:val="18"/>
+              </w:rPr>
+              <w:t xml:space="preserve">VISITE</w:t>
+            </w:r>
+          </w:p>
+        </w:tc>
+        <w:tc>
+          <w:tcPr>
+            <w:tcW w:type="dxa" w:w="2500"/>
+          </w:tcPr>
+          <w:p>
+            <w:r>
+              <w:rPr>
+                <w:b w:val="false"/>
+                <w:bCs w:val="false"/>
+                <w:sz w:val="18"/>
+                <w:szCs w:val="18"/>
+              </w:rPr>
+              <w:t xml:space="preserve">DateVisite</w:t>
+            </w:r>
+          </w:p>
+        </w:tc>
+        <w:tc>
+          <w:tcPr>
+            <w:tcW w:type="dxa" w:w="2500"/>
+          </w:tcPr>
+          <w:p>
+            <w:r>
+              <w:rPr>
+                <w:b w:val="false"/>
+                <w:bCs w:val="false"/>
+                <w:sz w:val="18"/>
+                <w:szCs w:val="18"/>
+              </w:rPr>
+              <w:t xml:space="preserve">date</w:t>
+            </w:r>
+          </w:p>
+        </w:tc>
+        <w:tc>
+          <w:tcPr>
+            <w:tcW w:type="dxa" w:w="2500"/>
+          </w:tcPr>
+          <w:p>
+            <w:r>
+              <w:rPr>
+                <w:b w:val="false"/>
+                <w:bCs w:val="false"/>
+                <w:sz w:val="18"/>
+                <w:szCs w:val="18"/>
+              </w:rPr>
+              <w:t xml:space="preserve">Date de la visite</w:t>
+            </w:r>
+          </w:p>
+        </w:tc>
+      </w:tr>
+      <w:tr>
+        <w:tc>
+          <w:tcPr>
+            <w:tcW w:type="dxa" w:w="2500"/>
+          </w:tcPr>
+          <w:p>
+            <w:r>
+              <w:rPr>
+                <w:b w:val="false"/>
+                <w:bCs w:val="false"/>
+                <w:sz w:val="18"/>
+                <w:szCs w:val="18"/>
+              </w:rPr>
+              <w:t xml:space="preserve">VISITE</w:t>
+            </w:r>
+          </w:p>
+        </w:tc>
+        <w:tc>
+          <w:tcPr>
+            <w:tcW w:type="dxa" w:w="2500"/>
+          </w:tcPr>
+          <w:p>
+            <w:r>
+              <w:rPr>
+                <w:b w:val="false"/>
+                <w:bCs w:val="false"/>
+                <w:sz w:val="18"/>
+                <w:szCs w:val="18"/>
+              </w:rPr>
+              <w:t xml:space="preserve">Motif</w:t>
+            </w:r>
+          </w:p>
+        </w:tc>
+        <w:tc>
+          <w:tcPr>
+            <w:tcW w:type="dxa" w:w="2500"/>
+          </w:tcPr>
+          <w:p>
+            <w:r>
+              <w:rPr>
+                <w:b w:val="false"/>
+                <w:bCs w:val="false"/>
+                <w:sz w:val="18"/>
+                <w:szCs w:val="18"/>
+              </w:rPr>
+              <w:t xml:space="preserve">varchar(200)</w:t>
+            </w:r>
+          </w:p>
+        </w:tc>
+        <w:tc>
+          <w:tcPr>
+            <w:tcW w:type="dxa" w:w="2500"/>
+          </w:tcPr>
+          <w:p>
+            <w:r>
+              <w:rPr>
+                <w:b w:val="false"/>
+                <w:bCs w:val="false"/>
+                <w:sz w:val="18"/>
+                <w:szCs w:val="18"/>
+              </w:rPr>
+              <w:t xml:space="preserve">Motif de la consultation</w:t>
+            </w:r>
+          </w:p>
+        </w:tc>
+      </w:tr>
+      <w:tr>
+        <w:tc>
+          <w:tcPr>
+            <w:tcW w:type="dxa" w:w="2500"/>
+          </w:tcPr>
+          <w:p>
+            <w:r>
+              <w:rPr>
+                <w:b w:val="false"/>
+                <w:bCs w:val="false"/>
+                <w:sz w:val="18"/>
+                <w:szCs w:val="18"/>
+              </w:rPr>
+              <w:t xml:space="preserve">VISITE</w:t>
+            </w:r>
+          </w:p>
+        </w:tc>
+        <w:tc>
+          <w:tcPr>
+            <w:tcW w:type="dxa" w:w="2500"/>
+          </w:tcPr>
+          <w:p>
+            <w:r>
+              <w:rPr>
+                <w:b w:val="false"/>
+                <w:bCs w:val="false"/>
+                <w:sz w:val="18"/>
+                <w:szCs w:val="18"/>
+              </w:rPr>
+              <w:t xml:space="preserve">Lieu</w:t>
+            </w:r>
+          </w:p>
+        </w:tc>
+        <w:tc>
+          <w:tcPr>
+            <w:tcW w:type="dxa" w:w="2500"/>
+          </w:tcPr>
+          <w:p>
+            <w:r>
+              <w:rPr>
+                <w:b w:val="false"/>
+                <w:bCs w:val="false"/>
+                <w:sz w:val="18"/>
+                <w:szCs w:val="18"/>
+              </w:rPr>
+              <w:t xml:space="preserve">varchar(50)</w:t>
+            </w:r>
+          </w:p>
+        </w:tc>
+        <w:tc>
+          <w:tcPr>
+            <w:tcW w:type="dxa" w:w="2500"/>
+          </w:tcPr>
+          <w:p>
+            <w:r>
+              <w:rPr>
+                <w:b w:val="false"/>
+                <w:bCs w:val="false"/>
+                <w:sz w:val="18"/>
+                <w:szCs w:val="18"/>
+              </w:rPr>
+              <w:t xml:space="preserve">Domicile ou cabinet</w:t>
+            </w:r>
+          </w:p>
+        </w:tc>
+      </w:tr>
+      <w:tr>
+        <w:tc>
+          <w:tcPr>
+            <w:tcW w:type="dxa" w:w="2500"/>
+          </w:tcPr>
+          <w:p>
+            <w:r>
+              <w:rPr>
+                <w:b w:val="false"/>
+                <w:bCs w:val="false"/>
+                <w:sz w:val="18"/>
+                <w:szCs w:val="18"/>
+              </w:rPr>
+              <w:t xml:space="preserve">ORD_MEDICAMENT</w:t>
+            </w:r>
+          </w:p>
+        </w:tc>
+        <w:tc>
+          <w:tcPr>
+            <w:tcW w:type="dxa" w:w="2500"/>
+          </w:tcPr>
+          <w:p>
+            <w:r>
+              <w:rPr>
+                <w:b w:val="false"/>
+                <w:bCs w:val="false"/>
+                <w:sz w:val="18"/>
+                <w:szCs w:val="18"/>
+              </w:rPr>
+              <w:t xml:space="preserve">NumOrdMed</w:t>
+            </w:r>
+          </w:p>
+        </w:tc>
+        <w:tc>
+          <w:tcPr>
+            <w:tcW w:type="dxa" w:w="2500"/>
+          </w:tcPr>
+          <w:p>
+            <w:r>
+              <w:rPr>
+                <w:b w:val="false"/>
+                <w:bCs w:val="false"/>
+                <w:sz w:val="18"/>
+                <w:szCs w:val="18"/>
+              </w:rPr>
+              <w:t xml:space="preserve">int</w:t>
+            </w:r>
+          </w:p>
+        </w:tc>
+        <w:tc>
+          <w:tcPr>
+            <w:tcW w:type="dxa" w:w="2500"/>
+          </w:tcPr>
+          <w:p>
+            <w:r>
+              <w:rPr>
+                <w:b w:val="false"/>
+                <w:bCs w:val="false"/>
+                <w:sz w:val="18"/>
+                <w:szCs w:val="18"/>
+              </w:rPr>
+              <w:t xml:space="preserve">Identifiant de l'ordonnance (PK)</w:t>
+            </w:r>
+          </w:p>
+        </w:tc>
+      </w:tr>
+      <w:tr>
+        <w:tc>
+          <w:tcPr>
+            <w:tcW w:type="dxa" w:w="2500"/>
+          </w:tcPr>
+          <w:p>
+            <w:r>
+              <w:rPr>
+                <w:b w:val="false"/>
+                <w:bCs w:val="false"/>
+                <w:sz w:val="18"/>
+                <w:szCs w:val="18"/>
+              </w:rPr>
+              <w:t xml:space="preserve">ORD_MEDICAMENT</w:t>
+            </w:r>
+          </w:p>
+        </w:tc>
+        <w:tc>
+          <w:tcPr>
+            <w:tcW w:type="dxa" w:w="2500"/>
+          </w:tcPr>
+          <w:p>
+            <w:r>
+              <w:rPr>
+                <w:b w:val="false"/>
+                <w:bCs w:val="false"/>
+                <w:sz w:val="18"/>
+                <w:szCs w:val="18"/>
+              </w:rPr>
+              <w:t xml:space="preserve">DateOrd</w:t>
+            </w:r>
+          </w:p>
+        </w:tc>
+        <w:tc>
+          <w:tcPr>
+            <w:tcW w:type="dxa" w:w="2500"/>
+          </w:tcPr>
+          <w:p>
+            <w:r>
+              <w:rPr>
+                <w:b w:val="false"/>
+                <w:bCs w:val="false"/>
+                <w:sz w:val="18"/>
+                <w:szCs w:val="18"/>
+              </w:rPr>
+              <w:t xml:space="preserve">date</w:t>
+            </w:r>
+          </w:p>
+        </w:tc>
+        <w:tc>
+          <w:tcPr>
+            <w:tcW w:type="dxa" w:w="2500"/>
+          </w:tcPr>
+          <w:p>
+            <w:r>
+              <w:rPr>
+                <w:b w:val="false"/>
+                <w:bCs w:val="false"/>
+                <w:sz w:val="18"/>
+                <w:szCs w:val="18"/>
+              </w:rPr>
+              <w:t xml:space="preserve">Date de l'ordonnance</w:t>
+            </w:r>
+          </w:p>
+        </w:tc>
+      </w:tr>
+      <w:tr>
+        <w:tc>
+          <w:tcPr>
+            <w:tcW w:type="dxa" w:w="2500"/>
+          </w:tcPr>
+          <w:p>
+            <w:r>
+              <w:rPr>
+                <w:b w:val="false"/>
+                <w:bCs w:val="false"/>
+                <w:sz w:val="18"/>
+                <w:szCs w:val="18"/>
+              </w:rPr>
+              <w:t xml:space="preserve">MEDICAMENT</w:t>
+            </w:r>
+          </w:p>
+        </w:tc>
+        <w:tc>
+          <w:tcPr>
+            <w:tcW w:type="dxa" w:w="2500"/>
+          </w:tcPr>
+          <w:p>
+            <w:r>
+              <w:rPr>
+                <w:b w:val="false"/>
+                <w:bCs w:val="false"/>
+                <w:sz w:val="18"/>
+                <w:szCs w:val="18"/>
+              </w:rPr>
+              <w:t xml:space="preserve">NumMedicament</w:t>
+            </w:r>
+          </w:p>
+        </w:tc>
+        <w:tc>
+          <w:tcPr>
+            <w:tcW w:type="dxa" w:w="2500"/>
+          </w:tcPr>
+          <w:p>
+            <w:r>
+              <w:rPr>
+                <w:b w:val="false"/>
+                <w:bCs w:val="false"/>
+                <w:sz w:val="18"/>
+                <w:szCs w:val="18"/>
+              </w:rPr>
+              <w:t xml:space="preserve">int</w:t>
+            </w:r>
+          </w:p>
+        </w:tc>
+        <w:tc>
+          <w:tcPr>
+            <w:tcW w:type="dxa" w:w="2500"/>
+          </w:tcPr>
+          <w:p>
+            <w:r>
+              <w:rPr>
+                <w:b w:val="false"/>
+                <w:bCs w:val="false"/>
+                <w:sz w:val="18"/>
+                <w:szCs w:val="18"/>
+              </w:rPr>
+              <w:t xml:space="preserve">Identifiant du medicament (PK)</w:t>
+            </w:r>
+          </w:p>
+        </w:tc>
+      </w:tr>
+      <w:tr>
+        <w:tc>
+          <w:tcPr>
+            <w:tcW w:type="dxa" w:w="2500"/>
+          </w:tcPr>
+          <w:p>
+            <w:r>
+              <w:rPr>
+                <w:b w:val="false"/>
+                <w:bCs w:val="false"/>
+                <w:sz w:val="18"/>
+                <w:szCs w:val="18"/>
+              </w:rPr>
+              <w:t xml:space="preserve">MEDICAMENT</w:t>
+            </w:r>
+          </w:p>
+        </w:tc>
+        <w:tc>
+          <w:tcPr>
+            <w:tcW w:type="dxa" w:w="2500"/>
+          </w:tcPr>
+          <w:p>
+            <w:r>
+              <w:rPr>
+                <w:b w:val="false"/>
+                <w:bCs w:val="false"/>
+                <w:sz w:val="18"/>
+                <w:szCs w:val="18"/>
+              </w:rPr>
+              <w:t xml:space="preserve">NomMedicament</w:t>
+            </w:r>
+          </w:p>
+        </w:tc>
+        <w:tc>
+          <w:tcPr>
+            <w:tcW w:type="dxa" w:w="2500"/>
+          </w:tcPr>
+          <w:p>
+            <w:r>
+              <w:rPr>
+                <w:b w:val="false"/>
+                <w:bCs w:val="false"/>
+                <w:sz w:val="18"/>
+                <w:szCs w:val="18"/>
+              </w:rPr>
+              <w:t xml:space="preserve">varchar(100)</w:t>
+            </w:r>
+          </w:p>
+        </w:tc>
+        <w:tc>
+          <w:tcPr>
+            <w:tcW w:type="dxa" w:w="2500"/>
+          </w:tcPr>
+          <w:p>
+            <w:r>
+              <w:rPr>
+                <w:b w:val="false"/>
+                <w:bCs w:val="false"/>
+                <w:sz w:val="18"/>
+                <w:szCs w:val="18"/>
+              </w:rPr>
+              <w:t xml:space="preserve">Nom du medicament</w:t>
+            </w:r>
+          </w:p>
+        </w:tc>
+      </w:tr>
+      <w:tr>
+        <w:tc>
+          <w:tcPr>
+            <w:tcW w:type="dxa" w:w="2500"/>
+          </w:tcPr>
+          <w:p>
+            <w:r>
+              <w:rPr>
+                <w:b w:val="false"/>
+                <w:bCs w:val="false"/>
+                <w:sz w:val="18"/>
+                <w:szCs w:val="18"/>
+              </w:rPr>
+              <w:t xml:space="preserve">MEDICAMENT</w:t>
+            </w:r>
+          </w:p>
+        </w:tc>
+        <w:tc>
+          <w:tcPr>
+            <w:tcW w:type="dxa" w:w="2500"/>
+          </w:tcPr>
+          <w:p>
+            <w:r>
+              <w:rPr>
+                <w:b w:val="false"/>
+                <w:bCs w:val="false"/>
+                <w:sz w:val="18"/>
+                <w:szCs w:val="18"/>
+              </w:rPr>
+              <w:t xml:space="preserve">Categorie</w:t>
+            </w:r>
+          </w:p>
+        </w:tc>
+        <w:tc>
+          <w:tcPr>
+            <w:tcW w:type="dxa" w:w="2500"/>
+          </w:tcPr>
+          <w:p>
+            <w:r>
+              <w:rPr>
+                <w:b w:val="false"/>
+                <w:bCs w:val="false"/>
+                <w:sz w:val="18"/>
+                <w:szCs w:val="18"/>
+              </w:rPr>
+              <w:t xml:space="preserve">varchar(100)</w:t>
+            </w:r>
+          </w:p>
+        </w:tc>
+        <w:tc>
+          <w:tcPr>
+            <w:tcW w:type="dxa" w:w="2500"/>
+          </w:tcPr>
+          <w:p>
+            <w:r>
+              <w:rPr>
+                <w:b w:val="false"/>
+                <w:bCs w:val="false"/>
+                <w:sz w:val="18"/>
+                <w:szCs w:val="18"/>
+              </w:rPr>
+              <w:t xml:space="preserve">Categorie du medicament</w:t>
+            </w:r>
+          </w:p>
+        </w:tc>
+      </w:tr>
+      <w:tr>
+        <w:tc>
+          <w:tcPr>
+            <w:tcW w:type="dxa" w:w="2500"/>
+          </w:tcPr>
+          <w:p>
+            <w:r>
+              <w:rPr>
+                <w:b w:val="false"/>
+                <w:bCs w:val="false"/>
+                <w:sz w:val="18"/>
+                <w:szCs w:val="18"/>
+              </w:rPr>
+              <w:t xml:space="preserve">MEDICAMENT</w:t>
+            </w:r>
+          </w:p>
+        </w:tc>
+        <w:tc>
+          <w:tcPr>
+            <w:tcW w:type="dxa" w:w="2500"/>
+          </w:tcPr>
+          <w:p>
+            <w:r>
+              <w:rPr>
+                <w:b w:val="false"/>
+                <w:bCs w:val="false"/>
+                <w:sz w:val="18"/>
+                <w:szCs w:val="18"/>
+              </w:rPr>
+              <w:t xml:space="preserve">Description</w:t>
+            </w:r>
+          </w:p>
+        </w:tc>
+        <w:tc>
+          <w:tcPr>
+            <w:tcW w:type="dxa" w:w="2500"/>
+          </w:tcPr>
+          <w:p>
+            <w:r>
+              <w:rPr>
+                <w:b w:val="false"/>
+                <w:bCs w:val="false"/>
+                <w:sz w:val="18"/>
+                <w:szCs w:val="18"/>
+              </w:rPr>
+              <w:t xml:space="preserve">text</w:t>
+            </w:r>
+          </w:p>
+        </w:tc>
+        <w:tc>
+          <w:tcPr>
+            <w:tcW w:type="dxa" w:w="2500"/>
+          </w:tcPr>
+          <w:p>
+            <w:r>
+              <w:rPr>
+                <w:b w:val="false"/>
+                <w:bCs w:val="false"/>
+                <w:sz w:val="18"/>
+                <w:szCs w:val="18"/>
+              </w:rPr>
+              <w:t xml:space="preserve">Description du medicament</w:t>
+            </w:r>
+          </w:p>
+        </w:tc>
+      </w:tr>
+      <w:tr>
+        <w:tc>
+          <w:tcPr>
+            <w:tcW w:type="dxa" w:w="2500"/>
+          </w:tcPr>
+          <w:p>
+            <w:r>
+              <w:rPr>
+                <w:b w:val="false"/>
+                <w:bCs w:val="false"/>
+                <w:sz w:val="18"/>
+                <w:szCs w:val="18"/>
+              </w:rPr>
+              <w:t xml:space="preserve">PRESCRIRE (assoc.)</w:t>
+            </w:r>
+          </w:p>
+        </w:tc>
+        <w:tc>
+          <w:tcPr>
+            <w:tcW w:type="dxa" w:w="2500"/>
+          </w:tcPr>
+          <w:p>
+            <w:r>
+              <w:rPr>
+                <w:b w:val="false"/>
+                <w:bCs w:val="false"/>
+                <w:sz w:val="18"/>
+                <w:szCs w:val="18"/>
+              </w:rPr>
+              <w:t xml:space="preserve">NbPrises</w:t>
+            </w:r>
+          </w:p>
+        </w:tc>
+        <w:tc>
+          <w:tcPr>
+            <w:tcW w:type="dxa" w:w="2500"/>
+          </w:tcPr>
+          <w:p>
+            <w:r>
+              <w:rPr>
+                <w:b w:val="false"/>
+                <w:bCs w:val="false"/>
+                <w:sz w:val="18"/>
+                <w:szCs w:val="18"/>
+              </w:rPr>
+              <w:t xml:space="preserve">int</w:t>
+            </w:r>
+          </w:p>
+        </w:tc>
+        <w:tc>
+          <w:tcPr>
+            <w:tcW w:type="dxa" w:w="2500"/>
+          </w:tcPr>
+          <w:p>
+            <w:r>
+              <w:rPr>
+                <w:b w:val="false"/>
+                <w:bCs w:val="false"/>
+                <w:sz w:val="18"/>
+                <w:szCs w:val="18"/>
+              </w:rPr>
+              <w:t xml:space="preserve">Nombre de prises</w:t>
+            </w:r>
+          </w:p>
+        </w:tc>
+      </w:tr>
+      <w:tr>
+        <w:tc>
+          <w:tcPr>
+            <w:tcW w:type="dxa" w:w="2500"/>
+          </w:tcPr>
+          <w:p>
+            <w:r>
+              <w:rPr>
+                <w:b w:val="false"/>
+                <w:bCs w:val="false"/>
+                <w:sz w:val="18"/>
+                <w:szCs w:val="18"/>
+              </w:rPr>
+              <w:t xml:space="preserve">PRESCRIRE (assoc.)</w:t>
+            </w:r>
+          </w:p>
+        </w:tc>
+        <w:tc>
+          <w:tcPr>
+            <w:tcW w:type="dxa" w:w="2500"/>
+          </w:tcPr>
+          <w:p>
+            <w:r>
+              <w:rPr>
+                <w:b w:val="false"/>
+                <w:bCs w:val="false"/>
+                <w:sz w:val="18"/>
+                <w:szCs w:val="18"/>
+              </w:rPr>
+              <w:t xml:space="preserve">NbDosesParPrise</w:t>
+            </w:r>
+          </w:p>
+        </w:tc>
+        <w:tc>
+          <w:tcPr>
+            <w:tcW w:type="dxa" w:w="2500"/>
+          </w:tcPr>
+          <w:p>
+            <w:r>
+              <w:rPr>
+                <w:b w:val="false"/>
+                <w:bCs w:val="false"/>
+                <w:sz w:val="18"/>
+                <w:szCs w:val="18"/>
+              </w:rPr>
+              <w:t xml:space="preserve">int</w:t>
+            </w:r>
+          </w:p>
+        </w:tc>
+        <w:tc>
+          <w:tcPr>
+            <w:tcW w:type="dxa" w:w="2500"/>
+          </w:tcPr>
+          <w:p>
+            <w:r>
+              <w:rPr>
+                <w:b w:val="false"/>
+                <w:bCs w:val="false"/>
+                <w:sz w:val="18"/>
+                <w:szCs w:val="18"/>
+              </w:rPr>
+              <w:t xml:space="preserve">Nombre de doses par prise</w:t>
+            </w:r>
+          </w:p>
+        </w:tc>
+      </w:tr>
+      <w:tr>
+        <w:tc>
+          <w:tcPr>
+            <w:tcW w:type="dxa" w:w="2500"/>
+          </w:tcPr>
+          <w:p>
+            <w:r>
+              <w:rPr>
+                <w:b w:val="false"/>
+                <w:bCs w:val="false"/>
+                <w:sz w:val="18"/>
+                <w:szCs w:val="18"/>
+              </w:rPr>
+              <w:t xml:space="preserve">PRESCRIRE (assoc.)</w:t>
+            </w:r>
+          </w:p>
+        </w:tc>
+        <w:tc>
+          <w:tcPr>
+            <w:tcW w:type="dxa" w:w="2500"/>
+          </w:tcPr>
+          <w:p>
+            <w:r>
+              <w:rPr>
+                <w:b w:val="false"/>
+                <w:bCs w:val="false"/>
+                <w:sz w:val="18"/>
+                <w:szCs w:val="18"/>
+              </w:rPr>
+              <w:t xml:space="preserve">FreqJournaliere</w:t>
+            </w:r>
+          </w:p>
+        </w:tc>
+        <w:tc>
+          <w:tcPr>
+            <w:tcW w:type="dxa" w:w="2500"/>
+          </w:tcPr>
+          <w:p>
+            <w:r>
+              <w:rPr>
+                <w:b w:val="false"/>
+                <w:bCs w:val="false"/>
+                <w:sz w:val="18"/>
+                <w:szCs w:val="18"/>
+              </w:rPr>
+              <w:t xml:space="preserve">int</w:t>
+            </w:r>
+          </w:p>
+        </w:tc>
+        <w:tc>
+          <w:tcPr>
+            <w:tcW w:type="dxa" w:w="2500"/>
+          </w:tcPr>
+          <w:p>
+            <w:r>
+              <w:rPr>
+                <w:b w:val="false"/>
+                <w:bCs w:val="false"/>
+                <w:sz w:val="18"/>
+                <w:szCs w:val="18"/>
+              </w:rPr>
+              <w:t xml:space="preserve">Frequence journaliere</w:t>
+            </w:r>
+          </w:p>
+        </w:tc>
+      </w:tr>
+      <w:tr>
+        <w:tc>
+          <w:tcPr>
+            <w:tcW w:type="dxa" w:w="2500"/>
+          </w:tcPr>
+          <w:p>
+            <w:r>
+              <w:rPr>
+                <w:b w:val="false"/>
+                <w:bCs w:val="false"/>
+                <w:sz w:val="18"/>
+                <w:szCs w:val="18"/>
+              </w:rPr>
+              <w:t xml:space="preserve">PRESCRIRE (assoc.)</w:t>
+            </w:r>
+          </w:p>
+        </w:tc>
+        <w:tc>
+          <w:tcPr>
+            <w:tcW w:type="dxa" w:w="2500"/>
+          </w:tcPr>
+          <w:p>
+            <w:r>
+              <w:rPr>
+                <w:b w:val="false"/>
+                <w:bCs w:val="false"/>
+                <w:sz w:val="18"/>
+                <w:szCs w:val="18"/>
+              </w:rPr>
+              <w:t xml:space="preserve">DureeTraitement</w:t>
+            </w:r>
+          </w:p>
+        </w:tc>
+        <w:tc>
+          <w:tcPr>
+            <w:tcW w:type="dxa" w:w="2500"/>
+          </w:tcPr>
+          <w:p>
+            <w:r>
+              <w:rPr>
+                <w:b w:val="false"/>
+                <w:bCs w:val="false"/>
+                <w:sz w:val="18"/>
+                <w:szCs w:val="18"/>
+              </w:rPr>
+              <w:t xml:space="preserve">int</w:t>
+            </w:r>
+          </w:p>
+        </w:tc>
+        <w:tc>
+          <w:tcPr>
+            <w:tcW w:type="dxa" w:w="2500"/>
+          </w:tcPr>
+          <w:p>
+            <w:r>
+              <w:rPr>
+                <w:b w:val="false"/>
+                <w:bCs w:val="false"/>
+                <w:sz w:val="18"/>
+                <w:szCs w:val="18"/>
+              </w:rPr>
+              <w:t xml:space="preserve">Duree du traitement (jours)</w:t>
+            </w:r>
+          </w:p>
+        </w:tc>
+      </w:tr>
+      <w:tr>
+        <w:tc>
+          <w:tcPr>
+            <w:tcW w:type="dxa" w:w="2500"/>
+          </w:tcPr>
+          <w:p>
+            <w:r>
+              <w:rPr>
+                <w:b w:val="false"/>
+                <w:bCs w:val="false"/>
+                <w:sz w:val="18"/>
+                <w:szCs w:val="18"/>
+              </w:rPr>
+              <w:t xml:space="preserve">ANALYSE</w:t>
+            </w:r>
+          </w:p>
+        </w:tc>
+        <w:tc>
+          <w:tcPr>
+            <w:tcW w:type="dxa" w:w="2500"/>
+          </w:tcPr>
+          <w:p>
+            <w:r>
+              <w:rPr>
+                <w:b w:val="false"/>
+                <w:bCs w:val="false"/>
+                <w:sz w:val="18"/>
+                <w:szCs w:val="18"/>
+              </w:rPr>
+              <w:t xml:space="preserve">NumAnalyse</w:t>
+            </w:r>
+          </w:p>
+        </w:tc>
+        <w:tc>
+          <w:tcPr>
+            <w:tcW w:type="dxa" w:w="2500"/>
+          </w:tcPr>
+          <w:p>
+            <w:r>
+              <w:rPr>
+                <w:b w:val="false"/>
+                <w:bCs w:val="false"/>
+                <w:sz w:val="18"/>
+                <w:szCs w:val="18"/>
+              </w:rPr>
+              <w:t xml:space="preserve">int</w:t>
+            </w:r>
+          </w:p>
+        </w:tc>
+        <w:tc>
+          <w:tcPr>
+            <w:tcW w:type="dxa" w:w="2500"/>
+          </w:tcPr>
+          <w:p>
+            <w:r>
+              <w:rPr>
+                <w:b w:val="false"/>
+                <w:bCs w:val="false"/>
+                <w:sz w:val="18"/>
+                <w:szCs w:val="18"/>
+              </w:rPr>
+              <w:t xml:space="preserve">Identifiant du type d'analyse (PK)</w:t>
+            </w:r>
+          </w:p>
+        </w:tc>
+      </w:tr>
+      <w:tr>
+        <w:tc>
+          <w:tcPr>
+            <w:tcW w:type="dxa" w:w="2500"/>
+          </w:tcPr>
+          <w:p>
+            <w:r>
+              <w:rPr>
+                <w:b w:val="false"/>
+                <w:bCs w:val="false"/>
+                <w:sz w:val="18"/>
+                <w:szCs w:val="18"/>
+              </w:rPr>
+              <w:t xml:space="preserve">ANALYSE</w:t>
+            </w:r>
+          </w:p>
+        </w:tc>
+        <w:tc>
+          <w:tcPr>
+            <w:tcW w:type="dxa" w:w="2500"/>
+          </w:tcPr>
+          <w:p>
+            <w:r>
+              <w:rPr>
+                <w:b w:val="false"/>
+                <w:bCs w:val="false"/>
+                <w:sz w:val="18"/>
+                <w:szCs w:val="18"/>
+              </w:rPr>
+              <w:t xml:space="preserve">LibelleAnalyse</w:t>
+            </w:r>
+          </w:p>
+        </w:tc>
+        <w:tc>
+          <w:tcPr>
+            <w:tcW w:type="dxa" w:w="2500"/>
+          </w:tcPr>
+          <w:p>
+            <w:r>
+              <w:rPr>
+                <w:b w:val="false"/>
+                <w:bCs w:val="false"/>
+                <w:sz w:val="18"/>
+                <w:szCs w:val="18"/>
+              </w:rPr>
+              <w:t xml:space="preserve">varchar(100)</w:t>
+            </w:r>
+          </w:p>
+        </w:tc>
+        <w:tc>
+          <w:tcPr>
+            <w:tcW w:type="dxa" w:w="2500"/>
+          </w:tcPr>
+          <w:p>
+            <w:r>
+              <w:rPr>
+                <w:b w:val="false"/>
+                <w:bCs w:val="false"/>
+                <w:sz w:val="18"/>
+                <w:szCs w:val="18"/>
+              </w:rPr>
+              <w:t xml:space="preserve">Libelle de l'analyse</w:t>
+            </w:r>
+          </w:p>
+        </w:tc>
+      </w:tr>
+      <w:tr>
+        <w:tc>
+          <w:tcPr>
+            <w:tcW w:type="dxa" w:w="2500"/>
+          </w:tcPr>
+          <w:p>
+            <w:r>
+              <w:rPr>
+                <w:b w:val="false"/>
+                <w:bCs w:val="false"/>
+                <w:sz w:val="18"/>
+                <w:szCs w:val="18"/>
+              </w:rPr>
+              <w:t xml:space="preserve">ORD_ANALYSE</w:t>
+            </w:r>
+          </w:p>
+        </w:tc>
+        <w:tc>
+          <w:tcPr>
+            <w:tcW w:type="dxa" w:w="2500"/>
+          </w:tcPr>
+          <w:p>
+            <w:r>
+              <w:rPr>
+                <w:b w:val="false"/>
+                <w:bCs w:val="false"/>
+                <w:sz w:val="18"/>
+                <w:szCs w:val="18"/>
+              </w:rPr>
+              <w:t xml:space="preserve">NumOrdAnalyse</w:t>
+            </w:r>
+          </w:p>
+        </w:tc>
+        <w:tc>
+          <w:tcPr>
+            <w:tcW w:type="dxa" w:w="2500"/>
+          </w:tcPr>
+          <w:p>
+            <w:r>
+              <w:rPr>
+                <w:b w:val="false"/>
+                <w:bCs w:val="false"/>
+                <w:sz w:val="18"/>
+                <w:szCs w:val="18"/>
+              </w:rPr>
+              <w:t xml:space="preserve">int</w:t>
+            </w:r>
+          </w:p>
+        </w:tc>
+        <w:tc>
+          <w:tcPr>
+            <w:tcW w:type="dxa" w:w="2500"/>
+          </w:tcPr>
+          <w:p>
+            <w:r>
+              <w:rPr>
+                <w:b w:val="false"/>
+                <w:bCs w:val="false"/>
+                <w:sz w:val="18"/>
+                <w:szCs w:val="18"/>
+              </w:rPr>
+              <w:t xml:space="preserve">Identifiant de l'ordonnance d'analyse (PK)</w:t>
+            </w:r>
+          </w:p>
+        </w:tc>
+      </w:tr>
+      <w:tr>
+        <w:tc>
+          <w:tcPr>
+            <w:tcW w:type="dxa" w:w="2500"/>
+          </w:tcPr>
+          <w:p>
+            <w:r>
+              <w:rPr>
+                <w:b w:val="false"/>
+                <w:bCs w:val="false"/>
+                <w:sz w:val="18"/>
+                <w:szCs w:val="18"/>
+              </w:rPr>
+              <w:t xml:space="preserve">ORD_ANALYSE</w:t>
+            </w:r>
+          </w:p>
+        </w:tc>
+        <w:tc>
+          <w:tcPr>
+            <w:tcW w:type="dxa" w:w="2500"/>
+          </w:tcPr>
+          <w:p>
+            <w:r>
+              <w:rPr>
+                <w:b w:val="false"/>
+                <w:bCs w:val="false"/>
+                <w:sz w:val="18"/>
+                <w:szCs w:val="18"/>
+              </w:rPr>
+              <w:t xml:space="preserve">DateOrd</w:t>
+            </w:r>
+          </w:p>
+        </w:tc>
+        <w:tc>
+          <w:tcPr>
+            <w:tcW w:type="dxa" w:w="2500"/>
+          </w:tcPr>
+          <w:p>
+            <w:r>
+              <w:rPr>
+                <w:b w:val="false"/>
+                <w:bCs w:val="false"/>
+                <w:sz w:val="18"/>
+                <w:szCs w:val="18"/>
+              </w:rPr>
+              <w:t xml:space="preserve">date</w:t>
+            </w:r>
+          </w:p>
+        </w:tc>
+        <w:tc>
+          <w:tcPr>
+            <w:tcW w:type="dxa" w:w="2500"/>
+          </w:tcPr>
+          <w:p>
+            <w:r>
+              <w:rPr>
+                <w:b w:val="false"/>
+                <w:bCs w:val="false"/>
+                <w:sz w:val="18"/>
+                <w:szCs w:val="18"/>
+              </w:rPr>
+              <w:t xml:space="preserve">Date de l'ordonnance</w:t>
+            </w:r>
+          </w:p>
+        </w:tc>
+      </w:tr>
+      <w:tr>
+        <w:tc>
+          <w:tcPr>
+            <w:tcW w:type="dxa" w:w="2500"/>
+          </w:tcPr>
+          <w:p>
+            <w:r>
+              <w:rPr>
+                <w:b w:val="false"/>
+                <w:bCs w:val="false"/>
+                <w:sz w:val="18"/>
+                <w:szCs w:val="18"/>
+              </w:rPr>
+              <w:t xml:space="preserve">DEMANDER (assoc.)</w:t>
+            </w:r>
+          </w:p>
+        </w:tc>
+        <w:tc>
+          <w:tcPr>
+            <w:tcW w:type="dxa" w:w="2500"/>
+          </w:tcPr>
+          <w:p>
+            <w:r>
+              <w:rPr>
+                <w:b w:val="false"/>
+                <w:bCs w:val="false"/>
+                <w:sz w:val="18"/>
+                <w:szCs w:val="18"/>
+              </w:rPr>
+              <w:t xml:space="preserve">ResultatRecu</w:t>
+            </w:r>
+          </w:p>
+        </w:tc>
+        <w:tc>
+          <w:tcPr>
+            <w:tcW w:type="dxa" w:w="2500"/>
+          </w:tcPr>
+          <w:p>
+            <w:r>
+              <w:rPr>
+                <w:b w:val="false"/>
+                <w:bCs w:val="false"/>
+                <w:sz w:val="18"/>
+                <w:szCs w:val="18"/>
+              </w:rPr>
+              <w:t xml:space="preserve">boolean</w:t>
+            </w:r>
+          </w:p>
+        </w:tc>
+        <w:tc>
+          <w:tcPr>
+            <w:tcW w:type="dxa" w:w="2500"/>
+          </w:tcPr>
+          <w:p>
+            <w:r>
+              <w:rPr>
+                <w:b w:val="false"/>
+                <w:bCs w:val="false"/>
+                <w:sz w:val="18"/>
+                <w:szCs w:val="18"/>
+              </w:rPr>
+              <w:t xml:space="preserve">Resultat recu ou non</w:t>
+            </w:r>
+          </w:p>
+        </w:tc>
+      </w:tr>
+      <w:tr>
+        <w:tc>
+          <w:tcPr>
+            <w:tcW w:type="dxa" w:w="2500"/>
+          </w:tcPr>
+          <w:p>
+            <w:r>
+              <w:rPr>
+                <w:b w:val="false"/>
+                <w:bCs w:val="false"/>
+                <w:sz w:val="18"/>
+                <w:szCs w:val="18"/>
+              </w:rPr>
+              <w:t xml:space="preserve">DEMANDER (assoc.)</w:t>
+            </w:r>
+          </w:p>
+        </w:tc>
+        <w:tc>
+          <w:tcPr>
+            <w:tcW w:type="dxa" w:w="2500"/>
+          </w:tcPr>
+          <w:p>
+            <w:r>
+              <w:rPr>
+                <w:b w:val="false"/>
+                <w:bCs w:val="false"/>
+                <w:sz w:val="18"/>
+                <w:szCs w:val="18"/>
+              </w:rPr>
+              <w:t xml:space="preserve">DateResultat</w:t>
+            </w:r>
+          </w:p>
+        </w:tc>
+        <w:tc>
+          <w:tcPr>
+            <w:tcW w:type="dxa" w:w="2500"/>
+          </w:tcPr>
+          <w:p>
+            <w:r>
+              <w:rPr>
+                <w:b w:val="false"/>
+                <w:bCs w:val="false"/>
+                <w:sz w:val="18"/>
+                <w:szCs w:val="18"/>
+              </w:rPr>
+              <w:t xml:space="preserve">date</w:t>
+            </w:r>
+          </w:p>
+        </w:tc>
+        <w:tc>
+          <w:tcPr>
+            <w:tcW w:type="dxa" w:w="2500"/>
+          </w:tcPr>
+          <w:p>
+            <w:r>
+              <w:rPr>
+                <w:b w:val="false"/>
+                <w:bCs w:val="false"/>
+                <w:sz w:val="18"/>
+                <w:szCs w:val="18"/>
+              </w:rPr>
+              <w:t xml:space="preserve">Date de reception du resultat</w:t>
+            </w:r>
+          </w:p>
+        </w:tc>
+      </w:tr>
+      <w:tr>
+        <w:tc>
+          <w:tcPr>
+            <w:tcW w:type="dxa" w:w="2500"/>
+          </w:tcPr>
+          <w:p>
+            <w:r>
+              <w:rPr>
+                <w:b w:val="false"/>
+                <w:bCs w:val="false"/>
+                <w:sz w:val="18"/>
+                <w:szCs w:val="18"/>
+              </w:rPr>
+              <w:t xml:space="preserve">MALADIE</w:t>
+            </w:r>
+          </w:p>
+        </w:tc>
+        <w:tc>
+          <w:tcPr>
+            <w:tcW w:type="dxa" w:w="2500"/>
+          </w:tcPr>
+          <w:p>
+            <w:r>
+              <w:rPr>
+                <w:b w:val="false"/>
+                <w:bCs w:val="false"/>
+                <w:sz w:val="18"/>
+                <w:szCs w:val="18"/>
+              </w:rPr>
+              <w:t xml:space="preserve">NumMaladie</w:t>
+            </w:r>
+          </w:p>
+        </w:tc>
+        <w:tc>
+          <w:tcPr>
+            <w:tcW w:type="dxa" w:w="2500"/>
+          </w:tcPr>
+          <w:p>
+            <w:r>
+              <w:rPr>
+                <w:b w:val="false"/>
+                <w:bCs w:val="false"/>
+                <w:sz w:val="18"/>
+                <w:szCs w:val="18"/>
+              </w:rPr>
+              <w:t xml:space="preserve">int</w:t>
+            </w:r>
+          </w:p>
+        </w:tc>
+        <w:tc>
+          <w:tcPr>
+            <w:tcW w:type="dxa" w:w="2500"/>
+          </w:tcPr>
+          <w:p>
+            <w:r>
+              <w:rPr>
+                <w:b w:val="false"/>
+                <w:bCs w:val="false"/>
+                <w:sz w:val="18"/>
+                <w:szCs w:val="18"/>
+              </w:rPr>
+              <w:t xml:space="preserve">Identifiant de la maladie (PK)</w:t>
+            </w:r>
+          </w:p>
+        </w:tc>
+      </w:tr>
+      <w:tr>
+        <w:tc>
+          <w:tcPr>
+            <w:tcW w:type="dxa" w:w="2500"/>
+          </w:tcPr>
+          <w:p>
+            <w:r>
+              <w:rPr>
+                <w:b w:val="false"/>
+                <w:bCs w:val="false"/>
+                <w:sz w:val="18"/>
+                <w:szCs w:val="18"/>
+              </w:rPr>
+              <w:t xml:space="preserve">MALADIE</w:t>
+            </w:r>
+          </w:p>
+        </w:tc>
+        <w:tc>
+          <w:tcPr>
+            <w:tcW w:type="dxa" w:w="2500"/>
+          </w:tcPr>
+          <w:p>
+            <w:r>
+              <w:rPr>
+                <w:b w:val="false"/>
+                <w:bCs w:val="false"/>
+                <w:sz w:val="18"/>
+                <w:szCs w:val="18"/>
+              </w:rPr>
+              <w:t xml:space="preserve">LibelleMaladie</w:t>
+            </w:r>
+          </w:p>
+        </w:tc>
+        <w:tc>
+          <w:tcPr>
+            <w:tcW w:type="dxa" w:w="2500"/>
+          </w:tcPr>
+          <w:p>
+            <w:r>
+              <w:rPr>
+                <w:b w:val="false"/>
+                <w:bCs w:val="false"/>
+                <w:sz w:val="18"/>
+                <w:szCs w:val="18"/>
+              </w:rPr>
+              <w:t xml:space="preserve">varchar(100)</w:t>
+            </w:r>
+          </w:p>
+        </w:tc>
+        <w:tc>
+          <w:tcPr>
+            <w:tcW w:type="dxa" w:w="2500"/>
+          </w:tcPr>
+          <w:p>
+            <w:r>
+              <w:rPr>
+                <w:b w:val="false"/>
+                <w:bCs w:val="false"/>
+                <w:sz w:val="18"/>
+                <w:szCs w:val="18"/>
+              </w:rPr>
+              <w:t xml:space="preserve">Libelle de la maladie</w:t>
+            </w:r>
+          </w:p>
+        </w:tc>
+      </w:tr>
+      <w:tr>
+        <w:tc>
+          <w:tcPr>
+            <w:tcW w:type="dxa" w:w="2500"/>
+          </w:tcPr>
+          <w:p>
+            <w:r>
+              <w:rPr>
+                <w:b w:val="false"/>
+                <w:bCs w:val="false"/>
+                <w:sz w:val="18"/>
+                <w:szCs w:val="18"/>
+              </w:rPr>
+              <w:t xml:space="preserve">ALLERGIE</w:t>
+            </w:r>
+          </w:p>
+        </w:tc>
+        <w:tc>
+          <w:tcPr>
+            <w:tcW w:type="dxa" w:w="2500"/>
+          </w:tcPr>
+          <w:p>
+            <w:r>
+              <w:rPr>
+                <w:b w:val="false"/>
+                <w:bCs w:val="false"/>
+                <w:sz w:val="18"/>
+                <w:szCs w:val="18"/>
+              </w:rPr>
+              <w:t xml:space="preserve">NumAllergie</w:t>
+            </w:r>
+          </w:p>
+        </w:tc>
+        <w:tc>
+          <w:tcPr>
+            <w:tcW w:type="dxa" w:w="2500"/>
+          </w:tcPr>
+          <w:p>
+            <w:r>
+              <w:rPr>
+                <w:b w:val="false"/>
+                <w:bCs w:val="false"/>
+                <w:sz w:val="18"/>
+                <w:szCs w:val="18"/>
+              </w:rPr>
+              <w:t xml:space="preserve">int</w:t>
+            </w:r>
+          </w:p>
+        </w:tc>
+        <w:tc>
+          <w:tcPr>
+            <w:tcW w:type="dxa" w:w="2500"/>
+          </w:tcPr>
+          <w:p>
+            <w:r>
+              <w:rPr>
+                <w:b w:val="false"/>
+                <w:bCs w:val="false"/>
+                <w:sz w:val="18"/>
+                <w:szCs w:val="18"/>
+              </w:rPr>
+              <w:t xml:space="preserve">Identifiant de l'allergie (PK)</w:t>
+            </w:r>
+          </w:p>
+        </w:tc>
+      </w:tr>
+      <w:tr>
+        <w:tc>
+          <w:tcPr>
+            <w:tcW w:type="dxa" w:w="2500"/>
+          </w:tcPr>
+          <w:p>
+            <w:r>
+              <w:rPr>
+                <w:b w:val="false"/>
+                <w:bCs w:val="false"/>
+                <w:sz w:val="18"/>
+                <w:szCs w:val="18"/>
+              </w:rPr>
+              <w:t xml:space="preserve">ALLERGIE</w:t>
+            </w:r>
+          </w:p>
+        </w:tc>
+        <w:tc>
+          <w:tcPr>
+            <w:tcW w:type="dxa" w:w="2500"/>
+          </w:tcPr>
+          <w:p>
+            <w:r>
+              <w:rPr>
+                <w:b w:val="false"/>
+                <w:bCs w:val="false"/>
+                <w:sz w:val="18"/>
+                <w:szCs w:val="18"/>
+              </w:rPr>
+              <w:t xml:space="preserve">LibelleAllergie</w:t>
+            </w:r>
+          </w:p>
+        </w:tc>
+        <w:tc>
+          <w:tcPr>
+            <w:tcW w:type="dxa" w:w="2500"/>
+          </w:tcPr>
+          <w:p>
+            <w:r>
+              <w:rPr>
+                <w:b w:val="false"/>
+                <w:bCs w:val="false"/>
+                <w:sz w:val="18"/>
+                <w:szCs w:val="18"/>
+              </w:rPr>
+              <w:t xml:space="preserve">varchar(100)</w:t>
+            </w:r>
+          </w:p>
+        </w:tc>
+        <w:tc>
+          <w:tcPr>
+            <w:tcW w:type="dxa" w:w="2500"/>
+          </w:tcPr>
+          <w:p>
+            <w:r>
+              <w:rPr>
+                <w:b w:val="false"/>
+                <w:bCs w:val="false"/>
+                <w:sz w:val="18"/>
+                <w:szCs w:val="18"/>
+              </w:rPr>
+              <w:t xml:space="preserve">Libelle de l'allergie</w:t>
+            </w:r>
+          </w:p>
+        </w:tc>
+      </w:tr>
+      <w:tr>
+        <w:tc>
+          <w:tcPr>
+            <w:tcW w:type="dxa" w:w="2500"/>
+          </w:tcPr>
+          <w:p>
+            <w:r>
+              <w:rPr>
+                <w:b w:val="false"/>
+                <w:bCs w:val="false"/>
+                <w:sz w:val="18"/>
+                <w:szCs w:val="18"/>
+              </w:rPr>
+              <w:t xml:space="preserve">ALLERGIE</w:t>
+            </w:r>
+          </w:p>
+        </w:tc>
+        <w:tc>
+          <w:tcPr>
+            <w:tcW w:type="dxa" w:w="2500"/>
+          </w:tcPr>
+          <w:p>
+            <w:r>
+              <w:rPr>
+                <w:b w:val="false"/>
+                <w:bCs w:val="false"/>
+                <w:sz w:val="18"/>
+                <w:szCs w:val="18"/>
+              </w:rPr>
+              <w:t xml:space="preserve">TypeAllergie</w:t>
+            </w:r>
+          </w:p>
+        </w:tc>
+        <w:tc>
+          <w:tcPr>
+            <w:tcW w:type="dxa" w:w="2500"/>
+          </w:tcPr>
+          <w:p>
+            <w:r>
+              <w:rPr>
+                <w:b w:val="false"/>
+                <w:bCs w:val="false"/>
+                <w:sz w:val="18"/>
+                <w:szCs w:val="18"/>
+              </w:rPr>
+              <w:t xml:space="preserve">varchar(100)</w:t>
+            </w:r>
+          </w:p>
+        </w:tc>
+        <w:tc>
+          <w:tcPr>
+            <w:tcW w:type="dxa" w:w="2500"/>
+          </w:tcPr>
+          <w:p>
+            <w:r>
+              <w:rPr>
+                <w:b w:val="false"/>
+                <w:bCs w:val="false"/>
+                <w:sz w:val="18"/>
+                <w:szCs w:val="18"/>
+              </w:rPr>
+              <w:t xml:space="preserve">Medicament ou famille de medicaments</w:t>
+            </w:r>
+          </w:p>
+        </w:tc>
+      </w:tr>
+      <w:tr>
+        <w:tc>
+          <w:tcPr>
+            <w:tcW w:type="dxa" w:w="2500"/>
+          </w:tcPr>
+          <w:p>
+            <w:r>
+              <w:rPr>
+                <w:b w:val="false"/>
+                <w:bCs w:val="false"/>
+                <w:sz w:val="18"/>
+                <w:szCs w:val="18"/>
+              </w:rPr>
+              <w:t xml:space="preserve">CENTRE_SANTE</w:t>
+            </w:r>
+          </w:p>
+        </w:tc>
+        <w:tc>
+          <w:tcPr>
+            <w:tcW w:type="dxa" w:w="2500"/>
+          </w:tcPr>
+          <w:p>
+            <w:r>
+              <w:rPr>
+                <w:b w:val="false"/>
+                <w:bCs w:val="false"/>
+                <w:sz w:val="18"/>
+                <w:szCs w:val="18"/>
+              </w:rPr>
+              <w:t xml:space="preserve">NumCentre</w:t>
+            </w:r>
+          </w:p>
+        </w:tc>
+        <w:tc>
+          <w:tcPr>
+            <w:tcW w:type="dxa" w:w="2500"/>
+          </w:tcPr>
+          <w:p>
+            <w:r>
+              <w:rPr>
+                <w:b w:val="false"/>
+                <w:bCs w:val="false"/>
+                <w:sz w:val="18"/>
+                <w:szCs w:val="18"/>
+              </w:rPr>
+              <w:t xml:space="preserve">int</w:t>
+            </w:r>
+          </w:p>
+        </w:tc>
+        <w:tc>
+          <w:tcPr>
+            <w:tcW w:type="dxa" w:w="2500"/>
+          </w:tcPr>
+          <w:p>
+            <w:r>
+              <w:rPr>
+                <w:b w:val="false"/>
+                <w:bCs w:val="false"/>
+                <w:sz w:val="18"/>
+                <w:szCs w:val="18"/>
+              </w:rPr>
+              <w:t xml:space="preserve">Identifiant du centre de sante (PK)</w:t>
+            </w:r>
+          </w:p>
+        </w:tc>
+      </w:tr>
+      <w:tr>
+        <w:tc>
+          <w:tcPr>
+            <w:tcW w:type="dxa" w:w="2500"/>
+          </w:tcPr>
+          <w:p>
+            <w:r>
+              <w:rPr>
+                <w:b w:val="false"/>
+                <w:bCs w:val="false"/>
+                <w:sz w:val="18"/>
+                <w:szCs w:val="18"/>
+              </w:rPr>
+              <w:t xml:space="preserve">CENTRE_SANTE</w:t>
+            </w:r>
+          </w:p>
+        </w:tc>
+        <w:tc>
+          <w:tcPr>
+            <w:tcW w:type="dxa" w:w="2500"/>
+          </w:tcPr>
+          <w:p>
+            <w:r>
+              <w:rPr>
+                <w:b w:val="false"/>
+                <w:bCs w:val="false"/>
+                <w:sz w:val="18"/>
+                <w:szCs w:val="18"/>
+              </w:rPr>
+              <w:t xml:space="preserve">NomCentre</w:t>
+            </w:r>
+          </w:p>
+        </w:tc>
+        <w:tc>
+          <w:tcPr>
+            <w:tcW w:type="dxa" w:w="2500"/>
+          </w:tcPr>
+          <w:p>
+            <w:r>
+              <w:rPr>
+                <w:b w:val="false"/>
+                <w:bCs w:val="false"/>
+                <w:sz w:val="18"/>
+                <w:szCs w:val="18"/>
+              </w:rPr>
+              <w:t xml:space="preserve">varchar(100)</w:t>
+            </w:r>
+          </w:p>
+        </w:tc>
+        <w:tc>
+          <w:tcPr>
+            <w:tcW w:type="dxa" w:w="2500"/>
+          </w:tcPr>
+          <w:p>
+            <w:r>
+              <w:rPr>
+                <w:b w:val="false"/>
+                <w:bCs w:val="false"/>
+                <w:sz w:val="18"/>
+                <w:szCs w:val="18"/>
+              </w:rPr>
+              <w:t xml:space="preserve">Nom du centre</w:t>
+            </w:r>
+          </w:p>
+        </w:tc>
+      </w:tr>
+      <w:tr>
+        <w:tc>
+          <w:tcPr>
+            <w:tcW w:type="dxa" w:w="2500"/>
+          </w:tcPr>
+          <w:p>
+            <w:r>
+              <w:rPr>
+                <w:b w:val="false"/>
+                <w:bCs w:val="false"/>
+                <w:sz w:val="18"/>
+                <w:szCs w:val="18"/>
+              </w:rPr>
+              <w:t xml:space="preserve">CENTRE_SANTE</w:t>
+            </w:r>
+          </w:p>
+        </w:tc>
+        <w:tc>
+          <w:tcPr>
+            <w:tcW w:type="dxa" w:w="2500"/>
+          </w:tcPr>
+          <w:p>
+            <w:r>
+              <w:rPr>
+                <w:b w:val="false"/>
+                <w:bCs w:val="false"/>
+                <w:sz w:val="18"/>
+                <w:szCs w:val="18"/>
+              </w:rPr>
+              <w:t xml:space="preserve">TypeCentre</w:t>
+            </w:r>
+          </w:p>
+        </w:tc>
+        <w:tc>
+          <w:tcPr>
+            <w:tcW w:type="dxa" w:w="2500"/>
+          </w:tcPr>
+          <w:p>
+            <w:r>
+              <w:rPr>
+                <w:b w:val="false"/>
+                <w:bCs w:val="false"/>
+                <w:sz w:val="18"/>
+                <w:szCs w:val="18"/>
+              </w:rPr>
+              <w:t xml:space="preserve">varchar(100)</w:t>
+            </w:r>
+          </w:p>
+        </w:tc>
+        <w:tc>
+          <w:tcPr>
+            <w:tcW w:type="dxa" w:w="2500"/>
+          </w:tcPr>
+          <w:p>
+            <w:r>
+              <w:rPr>
+                <w:b w:val="false"/>
+                <w:bCs w:val="false"/>
+                <w:sz w:val="18"/>
+                <w:szCs w:val="18"/>
+              </w:rPr>
+              <w:t xml:space="preserve">Hopital ou clinique</w:t>
+            </w:r>
+          </w:p>
+        </w:tc>
+      </w:tr>
+      <w:tr>
+        <w:tc>
+          <w:tcPr>
+            <w:tcW w:type="dxa" w:w="2500"/>
+          </w:tcPr>
+          <w:p>
+            <w:r>
+              <w:rPr>
+                <w:b w:val="false"/>
+                <w:bCs w:val="false"/>
+                <w:sz w:val="18"/>
+                <w:szCs w:val="18"/>
+              </w:rPr>
+              <w:t xml:space="preserve">SEJOUR</w:t>
+            </w:r>
+          </w:p>
+        </w:tc>
+        <w:tc>
+          <w:tcPr>
+            <w:tcW w:type="dxa" w:w="2500"/>
+          </w:tcPr>
+          <w:p>
+            <w:r>
+              <w:rPr>
+                <w:b w:val="false"/>
+                <w:bCs w:val="false"/>
+                <w:sz w:val="18"/>
+                <w:szCs w:val="18"/>
+              </w:rPr>
+              <w:t xml:space="preserve">NumSejour</w:t>
+            </w:r>
+          </w:p>
+        </w:tc>
+        <w:tc>
+          <w:tcPr>
+            <w:tcW w:type="dxa" w:w="2500"/>
+          </w:tcPr>
+          <w:p>
+            <w:r>
+              <w:rPr>
+                <w:b w:val="false"/>
+                <w:bCs w:val="false"/>
+                <w:sz w:val="18"/>
+                <w:szCs w:val="18"/>
+              </w:rPr>
+              <w:t xml:space="preserve">int</w:t>
+            </w:r>
+          </w:p>
+        </w:tc>
+        <w:tc>
+          <w:tcPr>
+            <w:tcW w:type="dxa" w:w="2500"/>
+          </w:tcPr>
+          <w:p>
+            <w:r>
+              <w:rPr>
+                <w:b w:val="false"/>
+                <w:bCs w:val="false"/>
+                <w:sz w:val="18"/>
+                <w:szCs w:val="18"/>
+              </w:rPr>
+              <w:t xml:space="preserve">Identifiant du sejour (PK)</w:t>
+            </w:r>
+          </w:p>
+        </w:tc>
+      </w:tr>
+      <w:tr>
+        <w:tc>
+          <w:tcPr>
+            <w:tcW w:type="dxa" w:w="2500"/>
+          </w:tcPr>
+          <w:p>
+            <w:r>
+              <w:rPr>
+                <w:b w:val="false"/>
+                <w:bCs w:val="false"/>
+                <w:sz w:val="18"/>
+                <w:szCs w:val="18"/>
+              </w:rPr>
+              <w:t xml:space="preserve">SEJOUR</w:t>
+            </w:r>
+          </w:p>
+        </w:tc>
+        <w:tc>
+          <w:tcPr>
+            <w:tcW w:type="dxa" w:w="2500"/>
+          </w:tcPr>
+          <w:p>
+            <w:r>
+              <w:rPr>
+                <w:b w:val="false"/>
+                <w:bCs w:val="false"/>
+                <w:sz w:val="18"/>
+                <w:szCs w:val="18"/>
+              </w:rPr>
+              <w:t xml:space="preserve">DateDebut</w:t>
+            </w:r>
+          </w:p>
+        </w:tc>
+        <w:tc>
+          <w:tcPr>
+            <w:tcW w:type="dxa" w:w="2500"/>
+          </w:tcPr>
+          <w:p>
+            <w:r>
+              <w:rPr>
+                <w:b w:val="false"/>
+                <w:bCs w:val="false"/>
+                <w:sz w:val="18"/>
+                <w:szCs w:val="18"/>
+              </w:rPr>
+              <w:t xml:space="preserve">date</w:t>
+            </w:r>
+          </w:p>
+        </w:tc>
+        <w:tc>
+          <w:tcPr>
+            <w:tcW w:type="dxa" w:w="2500"/>
+          </w:tcPr>
+          <w:p>
+            <w:r>
+              <w:rPr>
+                <w:b w:val="false"/>
+                <w:bCs w:val="false"/>
+                <w:sz w:val="18"/>
+                <w:szCs w:val="18"/>
+              </w:rPr>
+              <w:t xml:space="preserve">Date de debut du sejour</w:t>
+            </w:r>
+          </w:p>
+        </w:tc>
+      </w:tr>
+      <w:tr>
+        <w:tc>
+          <w:tcPr>
+            <w:tcW w:type="dxa" w:w="2500"/>
+          </w:tcPr>
+          <w:p>
+            <w:r>
+              <w:rPr>
+                <w:b w:val="false"/>
+                <w:bCs w:val="false"/>
+                <w:sz w:val="18"/>
+                <w:szCs w:val="18"/>
+              </w:rPr>
+              <w:t xml:space="preserve">SEJOUR</w:t>
+            </w:r>
+          </w:p>
+        </w:tc>
+        <w:tc>
+          <w:tcPr>
+            <w:tcW w:type="dxa" w:w="2500"/>
+          </w:tcPr>
+          <w:p>
+            <w:r>
+              <w:rPr>
+                <w:b w:val="false"/>
+                <w:bCs w:val="false"/>
+                <w:sz w:val="18"/>
+                <w:szCs w:val="18"/>
+              </w:rPr>
+              <w:t xml:space="preserve">DateFin</w:t>
+            </w:r>
+          </w:p>
+        </w:tc>
+        <w:tc>
+          <w:tcPr>
+            <w:tcW w:type="dxa" w:w="2500"/>
+          </w:tcPr>
+          <w:p>
+            <w:r>
+              <w:rPr>
+                <w:b w:val="false"/>
+                <w:bCs w:val="false"/>
+                <w:sz w:val="18"/>
+                <w:szCs w:val="18"/>
+              </w:rPr>
+              <w:t xml:space="preserve">date</w:t>
+            </w:r>
+          </w:p>
+        </w:tc>
+        <w:tc>
+          <w:tcPr>
+            <w:tcW w:type="dxa" w:w="2500"/>
+          </w:tcPr>
+          <w:p>
+            <w:r>
+              <w:rPr>
+                <w:b w:val="false"/>
+                <w:bCs w:val="false"/>
+                <w:sz w:val="18"/>
+                <w:szCs w:val="18"/>
+              </w:rPr>
+              <w:t xml:space="preserve">Date de fin du sejour</w:t>
+            </w:r>
+          </w:p>
+        </w:tc>
+      </w:tr>
+      <w:tr>
+        <w:tc>
+          <w:tcPr>
+            <w:tcW w:type="dxa" w:w="2500"/>
+          </w:tcPr>
+          <w:p>
+            <w:r>
+              <w:rPr>
+                <w:b w:val="false"/>
+                <w:bCs w:val="false"/>
+                <w:sz w:val="18"/>
+                <w:szCs w:val="18"/>
+              </w:rPr>
+              <w:t xml:space="preserve">OPERATION</w:t>
+            </w:r>
+          </w:p>
+        </w:tc>
+        <w:tc>
+          <w:tcPr>
+            <w:tcW w:type="dxa" w:w="2500"/>
+          </w:tcPr>
+          <w:p>
+            <w:r>
+              <w:rPr>
+                <w:b w:val="false"/>
+                <w:bCs w:val="false"/>
+                <w:sz w:val="18"/>
+                <w:szCs w:val="18"/>
+              </w:rPr>
+              <w:t xml:space="preserve">NumOperation</w:t>
+            </w:r>
+          </w:p>
+        </w:tc>
+        <w:tc>
+          <w:tcPr>
+            <w:tcW w:type="dxa" w:w="2500"/>
+          </w:tcPr>
+          <w:p>
+            <w:r>
+              <w:rPr>
+                <w:b w:val="false"/>
+                <w:bCs w:val="false"/>
+                <w:sz w:val="18"/>
+                <w:szCs w:val="18"/>
+              </w:rPr>
+              <w:t xml:space="preserve">int</w:t>
+            </w:r>
+          </w:p>
+        </w:tc>
+        <w:tc>
+          <w:tcPr>
+            <w:tcW w:type="dxa" w:w="2500"/>
+          </w:tcPr>
+          <w:p>
+            <w:r>
+              <w:rPr>
+                <w:b w:val="false"/>
+                <w:bCs w:val="false"/>
+                <w:sz w:val="18"/>
+                <w:szCs w:val="18"/>
+              </w:rPr>
+              <w:t xml:space="preserve">Identifiant de l'operation (PK)</w:t>
+            </w:r>
+          </w:p>
+        </w:tc>
+      </w:tr>
+      <w:tr>
+        <w:tc>
+          <w:tcPr>
+            <w:tcW w:type="dxa" w:w="2500"/>
+          </w:tcPr>
+          <w:p>
+            <w:r>
+              <w:rPr>
+                <w:b w:val="false"/>
+                <w:bCs w:val="false"/>
+                <w:sz w:val="18"/>
+                <w:szCs w:val="18"/>
+              </w:rPr>
+              <w:t xml:space="preserve">OPERATION</w:t>
+            </w:r>
+          </w:p>
+        </w:tc>
+        <w:tc>
+          <w:tcPr>
+            <w:tcW w:type="dxa" w:w="2500"/>
+          </w:tcPr>
+          <w:p>
+            <w:r>
+              <w:rPr>
+                <w:b w:val="false"/>
+                <w:bCs w:val="false"/>
+                <w:sz w:val="18"/>
+                <w:szCs w:val="18"/>
+              </w:rPr>
+              <w:t xml:space="preserve">LibelleOperation</w:t>
+            </w:r>
+          </w:p>
+        </w:tc>
+        <w:tc>
+          <w:tcPr>
+            <w:tcW w:type="dxa" w:w="2500"/>
+          </w:tcPr>
+          <w:p>
+            <w:r>
+              <w:rPr>
+                <w:b w:val="false"/>
+                <w:bCs w:val="false"/>
+                <w:sz w:val="18"/>
+                <w:szCs w:val="18"/>
+              </w:rPr>
+              <w:t xml:space="preserve">varchar(100)</w:t>
+            </w:r>
+          </w:p>
+        </w:tc>
+        <w:tc>
+          <w:tcPr>
+            <w:tcW w:type="dxa" w:w="2500"/>
+          </w:tcPr>
+          <w:p>
+            <w:r>
+              <w:rPr>
+                <w:b w:val="false"/>
+                <w:bCs w:val="false"/>
+                <w:sz w:val="18"/>
+                <w:szCs w:val="18"/>
+              </w:rPr>
+              <w:t xml:space="preserve">Libelle de l'operation</w:t>
+            </w:r>
+          </w:p>
+        </w:tc>
+      </w:tr>
+      <w:tr>
+        <w:tc>
+          <w:tcPr>
+            <w:tcW w:type="dxa" w:w="2500"/>
+          </w:tcPr>
+          <w:p>
+            <w:r>
+              <w:rPr>
+                <w:b w:val="false"/>
+                <w:bCs w:val="false"/>
+                <w:sz w:val="18"/>
+                <w:szCs w:val="18"/>
+              </w:rPr>
+              <w:t xml:space="preserve">OPERATION</w:t>
+            </w:r>
+          </w:p>
+        </w:tc>
+        <w:tc>
+          <w:tcPr>
+            <w:tcW w:type="dxa" w:w="2500"/>
+          </w:tcPr>
+          <w:p>
+            <w:r>
+              <w:rPr>
+                <w:b w:val="false"/>
+                <w:bCs w:val="false"/>
+                <w:sz w:val="18"/>
+                <w:szCs w:val="18"/>
+              </w:rPr>
+              <w:t xml:space="preserve">DateOperation</w:t>
+            </w:r>
+          </w:p>
+        </w:tc>
+        <w:tc>
+          <w:tcPr>
+            <w:tcW w:type="dxa" w:w="2500"/>
+          </w:tcPr>
+          <w:p>
+            <w:r>
+              <w:rPr>
+                <w:b w:val="false"/>
+                <w:bCs w:val="false"/>
+                <w:sz w:val="18"/>
+                <w:szCs w:val="18"/>
+              </w:rPr>
+              <w:t xml:space="preserve">date</w:t>
+            </w:r>
+          </w:p>
+        </w:tc>
+        <w:tc>
+          <w:tcPr>
+            <w:tcW w:type="dxa" w:w="2500"/>
+          </w:tcPr>
+          <w:p>
+            <w:r>
+              <w:rPr>
+                <w:b w:val="false"/>
+                <w:bCs w:val="false"/>
+                <w:sz w:val="18"/>
+                <w:szCs w:val="18"/>
+              </w:rPr>
+              <w:t xml:space="preserve">Date de l'operation</w:t>
+            </w:r>
+          </w:p>
+        </w:tc>
+      </w:tr>
+    </w:tbl>
+    <w:p>
+      <w:pPr>
+        <w:spacing w:after="200"/>
+      </w:pPr>
+    </w:p>
+    <w:p>
+      <w:pPr>
+        <w:pStyle w:val="Heading2"/>
+        <w:spacing w:after="150" w:before="300"/>
+      </w:pPr>
+      <w:r>
+        <w:t xml:space="preserve">3.2 Tables, cles primaires et cles etrangeres (MLD)</w:t>
       </w:r>
     </w:p>
     <w:p>
@@ -1350,7 +4501,7 @@
         <w:spacing w:after="150" w:before="300"/>
       </w:pPr>
       <w:r>
-        <w:t xml:space="preserve">3.2 Script SQL de creation de la base (Extrait)</w:t>
+        <w:t xml:space="preserve">3.3 Script SQL de creation de la base (Extrait)</w:t>
       </w:r>
     </w:p>
     <w:p>
@@ -2015,7 +5166,7 @@
         <w:spacing w:after="150" w:before="300"/>
       </w:pPr>
       <w:r>
-        <w:t xml:space="preserve">3.3 Triggers de validation</w:t>
+        <w:t xml:space="preserve">3.4 Triggers de validation</w:t>
       </w:r>
     </w:p>
     <w:p>

</xml_diff>